<commit_message>
Remove internal meta-notes from ebook manuscript
독자에게 보이면 안 되는 작업 메모 2곳 제거.
- 상단: "들어가며 + 01~04챕터 원고입니다..." 안내 문구
- 하단: "✅ 전자책 완성..." 안내 문구
Word 파일도 동일하게 재생성.

https://claude.ai/code/session_01Ug6bUYVxxEFVPP8vAnfqTG
</commit_message>
<xml_diff>
--- a/monetization/02_디지털제품/전자책_매출2배_카피공식.docx
+++ b/monetization/02_디지털제품/전자책_매출2배_카피공식.docx
@@ -14,36 +14,6 @@
           <w:sz w:val="48"/>
         </w:rPr>
         <w:t>전자책 원고 샘플 — 「하루 만에 쓰는 매출 2배 상세페이지 카피 공식」</w:t>
-      </w:r>
-    </w:p>
-    <w:p>
-      <w:pPr>
-        <w:spacing w:after="80"/>
-        <w:ind w:left="576"/>
-      </w:pPr>
-      <w:r>
-        <w:rPr>
-          <w:rFonts w:ascii="맑은 고딕" w:hAnsi="맑은 고딕"/>
-          <w:i/>
-          <w:color w:val="444466"/>
-          <w:sz w:val="22"/>
-        </w:rPr>
-        <w:t>들어가며 + 01~04챕터 원고입니다.</w:t>
-      </w:r>
-    </w:p>
-    <w:p>
-      <w:pPr>
-        <w:spacing w:after="80"/>
-        <w:ind w:left="576"/>
-      </w:pPr>
-      <w:r>
-        <w:rPr>
-          <w:rFonts w:ascii="맑은 고딕" w:hAnsi="맑은 고딕"/>
-          <w:i/>
-          <w:color w:val="444466"/>
-          <w:sz w:val="22"/>
-        </w:rPr>
-        <w:t>05챕터부터는 나(Claude)에게 "05챕터 이어서 써줘"라고 하면 계속 작성해드립니다.</w:t>
       </w:r>
     </w:p>
     <w:p>
@@ -12180,51 +12150,6 @@
     <w:p>
       <w:r>
         <w:t>────────────────────────────────────────</w:t>
-      </w:r>
-    </w:p>
-    <w:p>
-      <w:pPr>
-        <w:spacing w:after="80"/>
-        <w:ind w:left="576"/>
-      </w:pPr>
-      <w:r>
-        <w:rPr>
-          <w:rFonts w:ascii="맑은 고딕" w:hAnsi="맑은 고딕"/>
-          <w:i/>
-          <w:color w:val="444466"/>
-          <w:sz w:val="22"/>
-        </w:rPr>
-        <w:t>**✅ 전자책 완성 — 들어가며 + 01~10챕터 + 부록 + 맺음말**</w:t>
-      </w:r>
-    </w:p>
-    <w:p>
-      <w:pPr>
-        <w:spacing w:after="80"/>
-        <w:ind w:left="576"/>
-      </w:pPr>
-      <w:r>
-        <w:rPr>
-          <w:rFonts w:ascii="맑은 고딕" w:hAnsi="맑은 고딕"/>
-          <w:i/>
-          <w:color w:val="444466"/>
-          <w:sz w:val="22"/>
-        </w:rPr>
-        <w:t>이 파일을 PDF로 변환(Canva 또는 Word)하고 표지를 붙이면 판매 가능한 전자책이 됩니다.</w:t>
-      </w:r>
-    </w:p>
-    <w:p>
-      <w:pPr>
-        <w:spacing w:after="80"/>
-        <w:ind w:left="576"/>
-      </w:pPr>
-      <w:r>
-        <w:rPr>
-          <w:rFonts w:ascii="맑은 고딕" w:hAnsi="맑은 고딕"/>
-          <w:i/>
-          <w:color w:val="444466"/>
-          <w:sz w:val="22"/>
-        </w:rPr>
-        <w:t>표지는 Canva 무료 템플릿 → "전자책 표지" 검색 → 제목만 바꾸기.</w:t>
       </w:r>
     </w:p>
     <w:sectPr>

</xml_diff>

<commit_message>
Add table of contents and proper book title to ebook
목차 페이지 추가 (들어가며 / PART1~3 / 부록 / 맺음말 구조).
책 제목을 원고 샘플 안내 문구에서 실제 제목으로 교체.
Word 파일 재생성.

https://claude.ai/code/session_01Ug6bUYVxxEFVPP8vAnfqTG
</commit_message>
<xml_diff>
--- a/monetization/02_디지털제품/전자책_매출2배_카피공식.docx
+++ b/monetization/02_디지털제품/전자책_매출2배_카피공식.docx
@@ -13,7 +13,358 @@
           <w:color w:val="1A1A2E"/>
           <w:sz w:val="48"/>
         </w:rPr>
-        <w:t>전자책 원고 샘플 — 「하루 만에 쓰는 매출 2배 상세페이지 카피 공식」</w:t>
+        <w:t>하루 만에 쓰는 매출 2배 상세페이지 카피 공식</w:t>
+      </w:r>
+    </w:p>
+    <w:p>
+      <w:pPr>
+        <w:spacing w:after="80"/>
+      </w:pPr>
+      <w:r>
+        <w:rPr>
+          <w:rFonts w:ascii="맑은 고딕" w:hAnsi="맑은 고딕"/>
+          <w:sz w:val="22"/>
+        </w:rPr>
+      </w:r>
+      <w:r>
+        <w:rPr>
+          <w:rFonts w:ascii="맑은 고딕" w:hAnsi="맑은 고딕"/>
+          <w:b/>
+          <w:sz w:val="22"/>
+        </w:rPr>
+        <w:t>글 못 써도 됩니다. 공식만 채우면 팔립니다.</w:t>
+      </w:r>
+      <w:r>
+        <w:rPr>
+          <w:rFonts w:ascii="맑은 고딕" w:hAnsi="맑은 고딕"/>
+          <w:sz w:val="22"/>
+        </w:rPr>
+      </w:r>
+    </w:p>
+    <w:p>
+      <w:r>
+        <w:t>────────────────────────────────────────</w:t>
+      </w:r>
+    </w:p>
+    <w:p>
+      <w:pPr>
+        <w:pStyle w:val="Heading2"/>
+      </w:pPr>
+      <w:r>
+        <w:rPr>
+          <w:rFonts w:ascii="맑은 고딕" w:hAnsi="맑은 고딕"/>
+          <w:color w:val="16213E"/>
+          <w:sz w:val="32"/>
+        </w:rPr>
+        <w:t>목차</w:t>
+      </w:r>
+    </w:p>
+    <w:p>
+      <w:pPr>
+        <w:spacing w:after="60"/>
+      </w:pPr>
+      <w:r>
+        <w:rPr>
+          <w:rFonts w:ascii="맑은 고딕" w:hAnsi="맑은 고딕"/>
+          <w:sz w:val="22"/>
+        </w:rPr>
+      </w:r>
+      <w:r>
+        <w:rPr>
+          <w:rFonts w:ascii="맑은 고딕" w:hAnsi="맑은 고딕"/>
+          <w:b/>
+          <w:sz w:val="22"/>
+        </w:rPr>
+        <w:t>들어가며</w:t>
+      </w:r>
+      <w:r>
+        <w:rPr>
+          <w:rFonts w:ascii="맑은 고딕" w:hAnsi="맑은 고딕"/>
+          <w:sz w:val="22"/>
+        </w:rPr>
+        <w:t xml:space="preserve"> — 좋은 상품이 안 팔리는 진짜 이유</w:t>
+      </w:r>
+    </w:p>
+    <w:p>
+      <w:pPr>
+        <w:spacing w:after="60"/>
+      </w:pPr>
+      <w:r>
+        <w:rPr>
+          <w:rFonts w:ascii="맑은 고딕" w:hAnsi="맑은 고딕"/>
+          <w:sz w:val="22"/>
+        </w:rPr>
+      </w:r>
+      <w:r>
+        <w:rPr>
+          <w:rFonts w:ascii="맑은 고딕" w:hAnsi="맑은 고딕"/>
+          <w:b/>
+          <w:sz w:val="22"/>
+        </w:rPr>
+        <w:t>PART 1. 팔리는 글의 원리</w:t>
+      </w:r>
+      <w:r>
+        <w:rPr>
+          <w:rFonts w:ascii="맑은 고딕" w:hAnsi="맑은 고딕"/>
+          <w:sz w:val="22"/>
+        </w:rPr>
+      </w:r>
+    </w:p>
+    <w:p>
+      <w:pPr>
+        <w:spacing w:after="60"/>
+        <w:ind w:left="504"/>
+      </w:pPr>
+      <w:r>
+        <w:rPr>
+          <w:rFonts w:ascii="맑은 고딕" w:hAnsi="맑은 고딕"/>
+          <w:sz w:val="22"/>
+        </w:rPr>
+        <w:t>01. 고객은 상품이 아니라 '변화'를 산다</w:t>
+      </w:r>
+    </w:p>
+    <w:p>
+      <w:pPr>
+        <w:spacing w:after="60"/>
+        <w:ind w:left="504"/>
+      </w:pPr>
+      <w:r>
+        <w:rPr>
+          <w:rFonts w:ascii="맑은 고딕" w:hAnsi="맑은 고딕"/>
+          <w:sz w:val="22"/>
+        </w:rPr>
+        <w:t>02. 모든 카피의 뼈대 — 문제 → 공감 → 해결 → 증거 → 행동</w:t>
+      </w:r>
+    </w:p>
+    <w:p>
+      <w:pPr>
+        <w:spacing w:after="60"/>
+        <w:ind w:left="504"/>
+      </w:pPr>
+      <w:r>
+        <w:rPr>
+          <w:rFonts w:ascii="맑은 고딕" w:hAnsi="맑은 고딕"/>
+          <w:sz w:val="22"/>
+        </w:rPr>
+        <w:t>03. 첫 문장(헤드라인)이 80%다</w:t>
+      </w:r>
+    </w:p>
+    <w:p>
+      <w:pPr>
+        <w:spacing w:after="60"/>
+      </w:pPr>
+      <w:r>
+        <w:rPr>
+          <w:rFonts w:ascii="맑은 고딕" w:hAnsi="맑은 고딕"/>
+          <w:sz w:val="22"/>
+        </w:rPr>
+      </w:r>
+      <w:r>
+        <w:rPr>
+          <w:rFonts w:ascii="맑은 고딕" w:hAnsi="맑은 고딕"/>
+          <w:b/>
+          <w:sz w:val="22"/>
+        </w:rPr>
+        <w:t>PART 2. 그대로 베껴 쓰는 템플릿</w:t>
+      </w:r>
+      <w:r>
+        <w:rPr>
+          <w:rFonts w:ascii="맑은 고딕" w:hAnsi="맑은 고딕"/>
+          <w:sz w:val="22"/>
+        </w:rPr>
+      </w:r>
+    </w:p>
+    <w:p>
+      <w:pPr>
+        <w:spacing w:after="60"/>
+        <w:ind w:left="504"/>
+      </w:pPr>
+      <w:r>
+        <w:rPr>
+          <w:rFonts w:ascii="맑은 고딕" w:hAnsi="맑은 고딕"/>
+          <w:sz w:val="22"/>
+        </w:rPr>
+        <w:t>04. 후킹 헤드라인 30개 템플릿</w:t>
+      </w:r>
+    </w:p>
+    <w:p>
+      <w:pPr>
+        <w:spacing w:after="60"/>
+        <w:ind w:left="504"/>
+      </w:pPr>
+      <w:r>
+        <w:rPr>
+          <w:rFonts w:ascii="맑은 고딕" w:hAnsi="맑은 고딕"/>
+          <w:sz w:val="22"/>
+        </w:rPr>
+        <w:t>05. 오프닝 문단 — 헤드라인 다음 3초를 잡아라</w:t>
+      </w:r>
+    </w:p>
+    <w:p>
+      <w:pPr>
+        <w:spacing w:after="60"/>
+        <w:ind w:left="504"/>
+      </w:pPr>
+      <w:r>
+        <w:rPr>
+          <w:rFonts w:ascii="맑은 고딕" w:hAnsi="맑은 고딕"/>
+          <w:sz w:val="22"/>
+        </w:rPr>
+        <w:t>06. 베네핏 본문 작성법 — 스펙을 돈으로 바꾸는 번역기</w:t>
+      </w:r>
+    </w:p>
+    <w:p>
+      <w:pPr>
+        <w:spacing w:after="60"/>
+        <w:ind w:left="504"/>
+      </w:pPr>
+      <w:r>
+        <w:rPr>
+          <w:rFonts w:ascii="맑은 고딕" w:hAnsi="맑은 고딕"/>
+          <w:sz w:val="22"/>
+        </w:rPr>
+        <w:t>07. 구매를 부르는 CTA 문구 공식</w:t>
+      </w:r>
+    </w:p>
+    <w:p>
+      <w:pPr>
+        <w:spacing w:after="60"/>
+      </w:pPr>
+      <w:r>
+        <w:rPr>
+          <w:rFonts w:ascii="맑은 고딕" w:hAnsi="맑은 고딕"/>
+          <w:sz w:val="22"/>
+        </w:rPr>
+      </w:r>
+      <w:r>
+        <w:rPr>
+          <w:rFonts w:ascii="맑은 고딕" w:hAnsi="맑은 고딕"/>
+          <w:b/>
+          <w:sz w:val="22"/>
+        </w:rPr>
+        <w:t>PART 3. 실전 적용</w:t>
+      </w:r>
+      <w:r>
+        <w:rPr>
+          <w:rFonts w:ascii="맑은 고딕" w:hAnsi="맑은 고딕"/>
+          <w:sz w:val="22"/>
+        </w:rPr>
+      </w:r>
+    </w:p>
+    <w:p>
+      <w:pPr>
+        <w:spacing w:after="60"/>
+        <w:ind w:left="504"/>
+      </w:pPr>
+      <w:r>
+        <w:rPr>
+          <w:rFonts w:ascii="맑은 고딕" w:hAnsi="맑은 고딕"/>
+          <w:sz w:val="22"/>
+        </w:rPr>
+        <w:t>08. Before → After 리라이팅 사례 10개</w:t>
+      </w:r>
+    </w:p>
+    <w:p>
+      <w:pPr>
+        <w:spacing w:after="60"/>
+        <w:ind w:left="504"/>
+      </w:pPr>
+      <w:r>
+        <w:rPr>
+          <w:rFonts w:ascii="맑은 고딕" w:hAnsi="맑은 고딕"/>
+          <w:sz w:val="22"/>
+        </w:rPr>
+        <w:t>09. AI 프롬프트 활용법 — 카피 10배 빠르게 쓰기</w:t>
+      </w:r>
+    </w:p>
+    <w:p>
+      <w:pPr>
+        <w:spacing w:after="60"/>
+        <w:ind w:left="504"/>
+      </w:pPr>
+      <w:r>
+        <w:rPr>
+          <w:rFonts w:ascii="맑은 고딕" w:hAnsi="맑은 고딕"/>
+          <w:sz w:val="22"/>
+        </w:rPr>
+        <w:t>10. 상세페이지 완성 전 최종 체크리스트</w:t>
+      </w:r>
+    </w:p>
+    <w:p>
+      <w:pPr>
+        <w:spacing w:after="60"/>
+      </w:pPr>
+      <w:r>
+        <w:rPr>
+          <w:rFonts w:ascii="맑은 고딕" w:hAnsi="맑은 고딕"/>
+          <w:sz w:val="22"/>
+        </w:rPr>
+      </w:r>
+      <w:r>
+        <w:rPr>
+          <w:rFonts w:ascii="맑은 고딕" w:hAnsi="맑은 고딕"/>
+          <w:b/>
+          <w:sz w:val="22"/>
+        </w:rPr>
+        <w:t>부록</w:t>
+      </w:r>
+      <w:r>
+        <w:rPr>
+          <w:rFonts w:ascii="맑은 고딕" w:hAnsi="맑은 고딕"/>
+          <w:sz w:val="22"/>
+        </w:rPr>
+      </w:r>
+    </w:p>
+    <w:p>
+      <w:pPr>
+        <w:spacing w:after="60"/>
+        <w:ind w:left="504"/>
+      </w:pPr>
+      <w:r>
+        <w:rPr>
+          <w:rFonts w:ascii="맑은 고딕" w:hAnsi="맑은 고딕"/>
+          <w:sz w:val="22"/>
+        </w:rPr>
+        <w:t>핵심 원칙 카드 10개 (인쇄용)</w:t>
+      </w:r>
+    </w:p>
+    <w:p>
+      <w:pPr>
+        <w:spacing w:after="60"/>
+        <w:ind w:left="504"/>
+      </w:pPr>
+      <w:r>
+        <w:rPr>
+          <w:rFonts w:ascii="맑은 고딕" w:hAnsi="맑은 고딕"/>
+          <w:sz w:val="22"/>
+        </w:rPr>
+        <w:t>상품군별 스펙 → 베네핏 변환 치트시트</w:t>
+      </w:r>
+    </w:p>
+    <w:p>
+      <w:pPr>
+        <w:spacing w:after="60"/>
+      </w:pPr>
+      <w:r>
+        <w:rPr>
+          <w:rFonts w:ascii="맑은 고딕" w:hAnsi="맑은 고딕"/>
+          <w:sz w:val="22"/>
+        </w:rPr>
+      </w:r>
+      <w:r>
+        <w:rPr>
+          <w:rFonts w:ascii="맑은 고딕" w:hAnsi="맑은 고딕"/>
+          <w:b/>
+          <w:sz w:val="22"/>
+        </w:rPr>
+        <w:t>맺음말</w:t>
+      </w:r>
+      <w:r>
+        <w:rPr>
+          <w:rFonts w:ascii="맑은 고딕" w:hAnsi="맑은 고딕"/>
+          <w:sz w:val="22"/>
+        </w:rPr>
+        <w:t xml:space="preserve"> — 오늘, 딱 하나만 고쳐보세요</w:t>
       </w:r>
     </w:p>
     <w:p>

</xml_diff>

<commit_message>
Simplify TOC to show main chapter headings only
소제목 제외하고 큰 제목(Heading 2)만 목차에 표시.
목차가 1페이지로 줄어들어 본문이 2페이지부터 시작.

https://claude.ai/code/session_01Ug6bUYVxxEFVPP8vAnfqTG
</commit_message>
<xml_diff>
--- a/monetization/02_디지털제품/전자책_매출2배_카피공식.docx
+++ b/monetization/02_디지털제품/전자책_매출2배_카피공식.docx
@@ -76,17 +76,17 @@
           <w:color w:val="999999"/>
           <w:sz w:val="18"/>
         </w:rPr>
-        <w:t>※ 페이지 번호가 보이지 않으면: 목차 영역 클릭 → 마우스 우클릭 → [필드 업데이트] → [전체 목차 업데이트]</w:t>
+        <w:t>※ 페이지 번호 업데이트: 목차 클릭 → 마우스 우클릭 → [필드 업데이트] → [전체 목차 업데이트]</w:t>
       </w:r>
     </w:p>
     <w:p>
       <w:r>
         <w:fldChar w:fldCharType="begin"/>
-        <w:instrText xml:space="preserve"> TOC \o "2-3" \h \z \u </w:instrText>
+        <w:instrText xml:space="preserve"> TOC \o "2-2" \h \z \u </w:instrText>
         <w:fldChar w:fldCharType="separate"/>
       </w:r>
       <w:r>
-        <w:t>(목차 업데이트 필요 — 위 안내 참고)</w:t>
+        <w:t>(목차 업데이트 필요)</w:t>
       </w:r>
       <w:r>
         <w:fldChar w:fldCharType="end"/>

</xml_diff>

<commit_message>
Remove 목차 self-entry from Word TOC
Render '목차' heading as plain styled paragraph (not Heading 2)
so Word's auto-TOC field excludes it from the generated table of contents.

https://claude.ai/code/session_01Ug6bUYVxxEFVPP8vAnfqTG
</commit_message>
<xml_diff>
--- a/monetization/02_디지털제품/전자책_매출2배_카피공식.docx
+++ b/monetization/02_디지털제품/전자책_매출2배_카피공식.docx
@@ -53,11 +53,12 @@
     </w:p>
     <w:p>
       <w:pPr>
-        <w:pStyle w:val="Heading2"/>
-      </w:pPr>
-      <w:r>
-        <w:rPr>
-          <w:rFonts w:ascii="맑은 고딕" w:hAnsi="맑은 고딕"/>
+        <w:spacing w:before="240" w:after="160"/>
+      </w:pPr>
+      <w:r>
+        <w:rPr>
+          <w:rFonts w:ascii="맑은 고딕" w:hAnsi="맑은 고딕"/>
+          <w:b/>
           <w:color w:val="16213E"/>
           <w:sz w:val="32"/>
         </w:rPr>

</xml_diff>